<commit_message>
Update report.docx with GitHub repository link
</commit_message>
<xml_diff>
--- a/report.docx
+++ b/report.docx
@@ -815,13 +815,13 @@
             <w:vAlign w:val="center"/>
           </w:tcPr>
           <w:p>
-            <w:pPr>
-              <w:rPr>
-                <w:b/>
-                <w:bCs/>
-                <w:szCs w:val="24"/>
-              </w:rPr>
-            </w:pPr>
+            <w:r>
+              <w:rPr>
+                <w:rFonts w:ascii="Times New Roman" w:hAnsi="Times New Roman"/>
+                <w:sz w:val="22"/>
+              </w:rPr>
+              <w:t>https://github.com/aqmarilhan/SECR4483_AA_B23CS0027_AqmarIlhan</w:t>
+            </w:r>
           </w:p>
         </w:tc>
       </w:tr>
@@ -870,13 +870,13 @@
             <w:vAlign w:val="center"/>
           </w:tcPr>
           <w:p>
-            <w:pPr>
-              <w:rPr>
-                <w:b/>
-                <w:bCs/>
-                <w:szCs w:val="24"/>
-              </w:rPr>
-            </w:pPr>
+            <w:r>
+              <w:rPr>
+                <w:rFonts w:ascii="Times New Roman" w:hAnsi="Times New Roman"/>
+                <w:sz w:val="22"/>
+              </w:rPr>
+              <w:t>[INSERT YOUR UNLISTED YOUTUBE LINK HERE]</w:t>
+            </w:r>
           </w:p>
         </w:tc>
       </w:tr>

</xml_diff>